<commit_message>
Deck and script: first counting language model result; printable script refreshed
Co-Authored-By: Claude Sonnet 5.5 <noreply@anthropic.com>
Claude-Session: https://claude.ai/code/session_013SV3SfseaABNzbLHJy34eL
</commit_message>
<xml_diff>
--- a/docs/L_pitch_speaker_script.docx
+++ b/docs/L_pitch_speaker_script.docx
@@ -403,7 +403,7 @@
         <w:t xml:space="preserve"> </w:t>
       </w:r>
       <w:r>
-        <w:t xml:space="preserve">So the waste is in the model, and the model must change with the chip: a constant-size state, sparse activity so only a few rows are touched, low-bit or counting weights, and local learning by counting. We either alter an existing model to those rules or design a new one, and build the chip for exactly that. Model and chip designed together is the L bet. The small version works, as classifiers; the language-model version is untested, with tests that can prove it wrong.</w:t>
+        <w:t xml:space="preserve">So the waste is in the model, and the model must change with the chip: a constant-size state, sparse activity so only a few rows are touched, low-bit or counting weights, and local learning by counting. We either alter an existing model to those rules or design a new one, and build the chip for exactly that. Model and chip designed together is the L bet. The small version works, as classifiers. A first test of a counting language model is in: it learned English text online in one pass, and its quality grew with memory, 4.8 bits per character at 8 KB to 1.8 at 8 MB (simulated algorithm test, not on the chip, not yet compared with a neural model). It has tests that can prove it wrong.</w:t>
       </w:r>
       <w:r>
         <w:t xml:space="preserve">”</w:t>
@@ -505,7 +505,7 @@
         <w:t xml:space="preserve"> </w:t>
       </w:r>
       <w:r>
-        <w:t xml:space="preserve">A counting language model: hash the recent words into a sparse code, a table of counters predicts the next word one bit at a time. The counting classifier works in simulation; the language model is the next experiment.</w:t>
+        <w:t xml:space="preserve">A counting language model: hash the recent words into a sparse code, a table of counters predicts the next word one bit at a time. The counting classifier works in simulation. A first test of the language model is in: it learned English text online in one pass and quality grew with memory, 4.8 bits per character at 8 KB to 1.8 at 8 MB (simulated algorithm test; not yet on the chip, not yet compared with a neural model).</w:t>
       </w:r>
       <w:r>
         <w:t xml:space="preserve"> </w:t>
@@ -1435,7 +1435,7 @@
               <w:jc w:val="left"/>
             </w:pPr>
             <w:r>
-              <w:t xml:space="preserve">A counting classifier works with counts only; a counting language model is our next experiment</w:t>
+              <w:t xml:space="preserve">A counting classifier works with counts only</w:t>
             </w:r>
           </w:p>
         </w:tc>
@@ -1447,7 +1447,33 @@
               <w:jc w:val="left"/>
             </w:pPr>
             <w:r>
-              <w:t xml:space="preserve">SIMULATED / planned</w:t>
+              <w:t xml:space="preserve">SIMULATED</w:t>
+            </w:r>
+          </w:p>
+        </w:tc>
+      </w:tr>
+      <w:tr>
+        <w:tc>
+          <w:tcPr/>
+          <w:p>
+            <w:pPr>
+              <w:pStyle w:val="Compact"/>
+              <w:jc w:val="left"/>
+            </w:pPr>
+            <w:r>
+              <w:t xml:space="preserve">A counting language model, one pass online on 561 KB of English text: 4.83 bits per character at 8 KB, 1.80 at 8 MB (xz offline 1.54)</w:t>
+            </w:r>
+          </w:p>
+        </w:tc>
+        <w:tc>
+          <w:tcPr/>
+          <w:p>
+            <w:pPr>
+              <w:pStyle w:val="Compact"/>
+              <w:jc w:val="left"/>
+            </w:pPr>
+            <w:r>
+              <w:t xml:space="preserve">SIMULATED algorithm test; not on the chip; no neural baseline yet</w:t>
             </w:r>
           </w:p>
         </w:tc>

</xml_diff>

<commit_message>
Script, Q&A, deck: end-to-end numbers with the encoder; not faster than the GPU end to end
Co-Authored-By: Claude Sonnet 5.5 <noreply@anthropic.com>
Claude-Session: https://claude.ai/code/session_013SV3SfseaABNzbLHJy34eL
</commit_message>
<xml_diff>
--- a/docs/L_pitch_speaker_script.docx
+++ b/docs/L_pitch_speaker_script.docx
@@ -255,7 +255,7 @@
         <w:t xml:space="preserve"> </w:t>
       </w:r>
       <w:r>
-        <w:t xml:space="preserve">I measured it on my RTX 3050: one decision costs 69 millijoules alone and 1.95 in a batch of a thousand: 35 times worse when alone. A phone or a sensor decides one at a time.</w:t>
+        <w:t xml:space="preserve">I measured it on my RTX 3050, twice: one decision costs 12.6 to 69 millijoules alone and 0.29 to 1.95 in a batch of a thousand, 35 to 43 times worse when alone. A phone or a sensor decides one at a time.</w:t>
       </w:r>
       <w:r>
         <w:t xml:space="preserve"> </w:t>
@@ -707,17 +707,17 @@
         <w:t xml:space="preserve">“</w:t>
       </w:r>
       <w:r>
-        <w:t xml:space="preserve">Four processes, with labels. One decision alone: GPU 69 mJ (measured) against 0.18 to 0.26 microjoule from the layout, 9.4 nanojoules by operation count (estimated). One decision in a crowd of 1,024: GPU 1.95 mJ (measured); a device decides one at a time. Learning from 59,063 digit images: the CNN’s four-pass training used 1,148 joules (measured), the chip learns once, in place, about 3 joules (estimated, 45 to 62 microjoules per example). Learning a new class later: the GPU must retrain, and in stages it forgets; L learns in place.</w:t>
-      </w:r>
-      <w:r>
-        <w:t xml:space="preserve"> </w:t>
-      </w:r>
-      <w:r>
-        <w:rPr>
-          <w:bCs/>
-          <w:b/>
-        </w:rPr>
-        <w:t xml:space="preserve">Orders of magnitude, not a final ratio: the chip numbers are estimates for the core only, the GPU numbers are the whole GPU; the board run will measure L. The GPU still wins at training big models and batched throughput.</w:t>
+        <w:t xml:space="preserve">Four processes, with labels. One image alone, picture to answer: GPU 12.6 to 69 mJ in my two runs (measured) against about 14 microjoules for the chip (layout estimate with switching measured in simulation; the encoder is 13 of the 14). One image in a crowd of 1,024: GPU 0.29 to 1.95 mJ (measured); a device decides one at a time. Learning from 59,063 digit images: the CNN’s four-pass training used 1,148 joules (measured), the chip learns once, in place, about 4 joules (estimated, older gating assumptions with the encoder added). Learning a new class later: the GPU must retrain, and in stages it forgets; L learns in place.</w:t>
+      </w:r>
+      <w:r>
+        <w:t xml:space="preserve"> </w:t>
+      </w:r>
+      <w:r>
+        <w:rPr>
+          <w:bCs/>
+          <w:b/>
+        </w:rPr>
+        <w:t xml:space="preserve">Orders of magnitude, not a final ratio: the chip numbers are estimates, the GPU numbers are the whole GPU and changed between my two runs; the board run will measure L. The GPU still wins at training big models and batched throughput, and end to end the FPGA build is not faster than this GPU.</w:t>
       </w:r>
       <w:r>
         <w:t xml:space="preserve">”</w:t>
@@ -821,7 +821,7 @@
           <w:bCs/>
           <w:b/>
         </w:rPr>
-        <w:t xml:space="preserve">35 times worse at batch 1</w:t>
+        <w:t xml:space="preserve">35 to 43 times worse at batch 1</w:t>
       </w:r>
       <w:r>
         <w:t xml:space="preserve">,</w:t>
@@ -1029,7 +1029,7 @@
         <w:t xml:space="preserve"> </w:t>
       </w:r>
       <w:r>
-        <w:t xml:space="preserve">- Do not call the energy number measured. The 74 times is an operation count; only the RTX 3050 numbers are measured.</w:t>
+        <w:t xml:space="preserve">- Do not call the energy number measured. The 74 times is an operation count (a lower bound) and the 14 µJ is a layout estimate; only the RTX 3050 numbers are measured. Do not say the chip is faster than the GPU: end to end at 27 MHz it is not (0.83 ms against 0.42 ms at batch 1); say its advantage is energy and learning on the device.</w:t>
       </w:r>
       <w:r>
         <w:t xml:space="preserve"> </w:t>
@@ -1230,7 +1230,7 @@
               <w:jc w:val="left"/>
             </w:pPr>
             <w:r>
-              <w:t xml:space="preserve">One decision costs 69 mJ at batch 1 and 1.95 mJ at batch 1024 on my GPU (35 times)</w:t>
+              <w:t xml:space="preserve">One image costs 12.6 to 69 mJ at batch 1 and 0.29 to 1.95 mJ at batch 1024 on my GPU (two runs; 35 to 43 times worse alone)</w:t>
             </w:r>
           </w:p>
         </w:tc>
@@ -1347,19 +1347,19 @@
               <w:jc w:val="left"/>
             </w:pPr>
             <w:r>
-              <w:t xml:space="preserve">One digit decision: about 1,500 cycles, 55.7 µs at 27 MHz (FPGA build); about 320 cycles, 11.7 µs (pipelined option); GPU batch 1 about 1.8 ms</w:t>
-            </w:r>
-          </w:p>
-        </w:tc>
-        <w:tc>
-          <w:tcPr/>
-          <w:p>
-            <w:pPr>
-              <w:pStyle w:val="Compact"/>
-              <w:jc w:val="left"/>
-            </w:pPr>
-            <w:r>
-              <w:t xml:space="preserve">chip ESTIMATED from simulated cycles; GPU</w:t>
+              <w:t xml:space="preserve">Picture to answer: the encoder takes 21,378 cycles and the decision about 1,500 (FPGA build) or 320 (pipelined), so about 0.83 ms at the 27 MHz FPGA clock and 0.45 ms at 50 MHz; the decision alone is 55.7 µs or 11.7 µs. GPU batch 1: 0.42 to 1.8 ms</w:t>
+            </w:r>
+          </w:p>
+        </w:tc>
+        <w:tc>
+          <w:tcPr/>
+          <w:p>
+            <w:pPr>
+              <w:pStyle w:val="Compact"/>
+              <w:jc w:val="left"/>
+            </w:pPr>
+            <w:r>
+              <w:t xml:space="preserve">chip cycles SIMULATED, times ESTIMATED; GPU</w:t>
             </w:r>
             <w:r>
               <w:t xml:space="preserve"> </w:t>
@@ -1370,6 +1370,68 @@
                 <w:b/>
               </w:rPr>
               <w:t xml:space="preserve">MEASURED</w:t>
+            </w:r>
+          </w:p>
+        </w:tc>
+      </w:tr>
+      <w:tr>
+        <w:tc>
+          <w:tcPr/>
+          <w:p>
+            <w:pPr>
+              <w:pStyle w:val="Compact"/>
+              <w:jc w:val="left"/>
+            </w:pPr>
+            <w:r>
+              <w:t xml:space="preserve">Picture to answer energy: about 14 µJ, about 30 mW while encoding (layout power analysis with switching measured in simulation on real MNIST images); GPU 12.6 to 69 mJ, about 30 to 40 W while running</w:t>
+            </w:r>
+          </w:p>
+        </w:tc>
+        <w:tc>
+          <w:tcPr/>
+          <w:p>
+            <w:pPr>
+              <w:pStyle w:val="Compact"/>
+              <w:jc w:val="left"/>
+            </w:pPr>
+            <w:r>
+              <w:t xml:space="preserve">chip ESTIMATED; GPU</w:t>
+            </w:r>
+            <w:r>
+              <w:t xml:space="preserve"> </w:t>
+            </w:r>
+            <w:r>
+              <w:rPr>
+                <w:bCs/>
+                <w:b/>
+              </w:rPr>
+              <w:t xml:space="preserve">MEASURED</w:t>
+            </w:r>
+          </w:p>
+        </w:tc>
+      </w:tr>
+      <w:tr>
+        <w:tc>
+          <w:tcPr/>
+          <w:p>
+            <w:pPr>
+              <w:pStyle w:val="Compact"/>
+              <w:jc w:val="left"/>
+            </w:pPr>
+            <w:r>
+              <w:t xml:space="preserve">Picture to answer, chip against GPU: about 20 to 5,000 times less energy depending on the GPU’s power state and batch</w:t>
+            </w:r>
+          </w:p>
+        </w:tc>
+        <w:tc>
+          <w:tcPr/>
+          <w:p>
+            <w:pPr>
+              <w:pStyle w:val="Compact"/>
+              <w:jc w:val="left"/>
+            </w:pPr>
+            <w:r>
+              <w:t xml:space="preserve">ESTIMATED against MEASURED</w:t>
             </w:r>
           </w:p>
         </w:tc>
@@ -2142,26 +2204,26 @@
           <w:bCs/>
           <w:b/>
         </w:rPr>
-        <w:t xml:space="preserve">15. Chip design against a real GPU (0:55).</w:t>
-      </w:r>
-      <w:r>
-        <w:t xml:space="preserve"> </w:t>
-      </w:r>
-      <w:r>
-        <w:t xml:space="preserve">“</w:t>
-      </w:r>
-      <w:r>
-        <w:t xml:space="preserve">Same decision on my RTX 3050. Measured: about 1.8 milliseconds and 69 millijoules at batch one; 22,000 decisions a second at batch 1024. The chip design needs about 1,500 cycles per decision: 56 microseconds at 27 megahertz, 12 in the pipelined option.</w:t>
-      </w:r>
-      <w:r>
-        <w:t xml:space="preserve"> </w:t>
-      </w:r>
-      <w:r>
-        <w:rPr>
-          <w:bCs/>
-          <w:b/>
-        </w:rPr>
-        <w:t xml:space="preserve">Chip times are estimates from simulated cycles, not a board run. The GPU wins when it can batch.</w:t>
+        <w:t xml:space="preserve">15. Picture to answer: chip against a real GPU (0:55).</w:t>
+      </w:r>
+      <w:r>
+        <w:t xml:space="preserve"> </w:t>
+      </w:r>
+      <w:r>
+        <w:t xml:space="preserve">“</w:t>
+      </w:r>
+      <w:r>
+        <w:t xml:space="preserve">Same job on my RTX 3050, picture to answer. Measured, in two runs: about 0.4 to 1.8 milliseconds and 12 to 69 millijoules at batch one; up to 98,000 images a second at batch 1024. The chip design: the encoder takes 21,378 cycles and the decision about 1,500, so about 0.83 milliseconds at the 27 megahertz FPGA clock and about 14 microjoules, about 30 milliwatts while encoding, from the layout with switching measured in simulation.</w:t>
+      </w:r>
+      <w:r>
+        <w:t xml:space="preserve"> </w:t>
+      </w:r>
+      <w:r>
+        <w:rPr>
+          <w:bCs/>
+          <w:b/>
+        </w:rPr>
+        <w:t xml:space="preserve">So end to end the FPGA build is not faster than this GPU; its advantage is energy, about 20 to 5,000 times lower depending on the GPU’s power state, and learning on the device. Chip numbers are estimates, not a board run.</w:t>
       </w:r>
       <w:r>
         <w:t xml:space="preserve">”</w:t>
@@ -2182,20 +2244,26 @@
         <w:t xml:space="preserve"> </w:t>
       </w:r>
       <w:r>
-        <w:t xml:space="preserve">“</w:t>
-      </w:r>
-      <w:r>
-        <w:t xml:space="preserve">Four processes. One decision alone: my laptop GPU used 69 millijoules, measured; the chip design is estimated at about 0.2 microjoule from the layout and 9 nanojoules by counting operations. In a crowd of a thousand the GPU improves to 2 millijoules, but a device decides one input at a time. Learning from 59 thousand digit images: the CNN trained for four passes and used 1,148 joules, measured; the chip learns each example once, in place, about 45 to 62 microjoules each, so about 3 joules, estimated. Learning a new class later: the GPU retrains in a data centre and in stages it forgets, the chip learns in place.</w:t>
-      </w:r>
-      <w:r>
-        <w:t xml:space="preserve"> </w:t>
-      </w:r>
-      <w:r>
-        <w:rPr>
-          <w:bCs/>
-          <w:b/>
-        </w:rPr>
-        <w:t xml:space="preserve">Read these as orders of magnitude: the chip numbers are estimates for the core only, the GPU numbers are the whole GPU. The GPU still wins at training big models and at batched throughput. The board run will measure L.</w:t>
+        <w:t xml:space="preserve">Say the four processes from the table on the slide.</w:t>
+      </w:r>
+      <w:r>
+        <w:t xml:space="preserve"> </w:t>
+      </w:r>
+      <w:r>
+        <w:t xml:space="preserve">“</w:t>
+      </w:r>
+      <w:r>
+        <w:t xml:space="preserve">One image alone: GPU 12.6 to 69 millijoules, measured; the chip about 14 microjoules, estimated. In a crowd of 1,024 the GPU improves to 0.29 to 1.95 millijoules, but a device decides one at a time. Learning from 59 thousand images: the CNN used 1,148 joules over four passes, the chip learns each example once, in place, about 4 joules, estimated. A new class later: the GPU retrains and in stages forgets, the chip learns in place.</w:t>
+      </w:r>
+      <w:r>
+        <w:t xml:space="preserve"> </w:t>
+      </w:r>
+      <w:r>
+        <w:rPr>
+          <w:bCs/>
+          <w:b/>
+        </w:rPr>
+        <w:t xml:space="preserve">Orders of magnitude, not a final ratio. The GPU still wins at training big models and batched throughput. The board run will measure L.</w:t>
       </w:r>
       <w:r>
         <w:t xml:space="preserve">”</w:t>
@@ -2969,7 +3037,7 @@
           <w:bCs/>
           <w:b/>
         </w:rPr>
-        <w:t xml:space="preserve">35 times worse at batch 1</w:t>
+        <w:t xml:space="preserve">35 to 43 times worse at batch 1</w:t>
       </w:r>
       <w:r>
         <w:t xml:space="preserve">,</w:t>
@@ -2996,6 +3064,19 @@
           <w:b/>
         </w:rPr>
         <w:t xml:space="preserve">41 of 41</w:t>
+      </w:r>
+      <w:r>
+        <w:t xml:space="preserve">,</w:t>
+      </w:r>
+      <w:r>
+        <w:t xml:space="preserve"> </w:t>
+      </w:r>
+      <w:r>
+        <w:rPr>
+          <w:bCs/>
+          <w:b/>
+        </w:rPr>
+        <w:t xml:space="preserve">about 14 µJ against 12.6 to 69 mJ</w:t>
       </w:r>
       <w:r>
         <w:t xml:space="preserve">.</w:t>

</xml_diff>